<commit_message>
Updates to Word manuscript.
</commit_message>
<xml_diff>
--- a/custom-reference-doc.docx
+++ b/custom-reference-doc.docx
@@ -135,6 +135,7 @@
     <w:p>
       <w:pPr>
         <w:pStyle w:val="FirstParagraph"/>
+        <w:ind w:firstLine="0"/>
       </w:pPr>
       <w:r>
         <w:t xml:space="preserve"> First Paragraph. </w:t>
@@ -296,6 +297,7 @@
         <w:pStyle w:val="DefinitionTerm"/>
       </w:pPr>
       <w:r>
+        <w:lastRenderedPageBreak/>
         <w:t xml:space="preserve"> DefinitionTerm </w:t>
       </w:r>
     </w:p>
@@ -320,9 +322,6 @@
 <w:endnotes xmlns:wpc="http://schemas.microsoft.com/office/word/2010/wordprocessingCanvas" xmlns:cx="http://schemas.microsoft.com/office/drawing/2014/chartex" xmlns:cx1="http://schemas.microsoft.com/office/drawing/2015/9/8/chartex" xmlns:cx2="http://schemas.microsoft.com/office/drawing/2015/10/21/chartex" xmlns:cx3="http://schemas.microsoft.com/office/drawing/2016/5/9/chartex" xmlns:cx4="http://schemas.microsoft.com/office/drawing/2016/5/10/chartex" xmlns:cx5="http://schemas.microsoft.com/office/drawing/2016/5/11/chartex" xmlns:cx6="http://schemas.microsoft.com/office/drawing/2016/5/12/chartex" xmlns:cx7="http://schemas.microsoft.com/office/drawing/2016/5/13/chartex" xmlns:cx8="http://schemas.microsoft.com/office/drawing/2016/5/14/chartex" xmlns:mc="http://schemas.openxmlformats.org/markup-compatibility/2006" xmlns:aink="http://schemas.microsoft.com/office/drawing/2016/ink" xmlns:am3d="http://schemas.microsoft.com/office/drawing/2017/model3d" xmlns:o="urn:schemas-microsoft-com:office:office" xmlns:oel="http://schemas.microsoft.com/office/2019/extlst" xmlns:r="http://schemas.openxmlformats.org/officeDocument/2006/relationships" xmlns:m="http://schemas.openxmlformats.org/officeDocument/2006/math" xmlns:v="urn:schemas-microsoft-com:vml" xmlns:wp14="http://schemas.microsoft.com/office/word/2010/wordprocessingDrawing" xmlns:wp="http://schemas.openxmlformats.org/drawingml/2006/wordprocessingDrawing" xmlns:w10="urn:schemas-microsoft-com:office:word" xmlns:w="http://schemas.openxmlformats.org/wordprocessingml/2006/main" xmlns:w14="http://schemas.microsoft.com/office/word/2010/wordml" xmlns:w15="http://schemas.microsoft.com/office/word/2012/wordml" xmlns:w16cex="http://schemas.microsoft.com/office/word/2018/wordml/cex" xmlns:w16cid="http://schemas.microsoft.com/office/word/2016/wordml/cid" xmlns:w16="http://schemas.microsoft.com/office/word/2018/wordml" xmlns:w16du="http://schemas.microsoft.com/office/word/2023/wordml/word16du" xmlns:w16sdtdh="http://schemas.microsoft.com/office/word/2020/wordml/sdtdatahash" xmlns:w16se="http://schemas.microsoft.com/office/word/2015/wordml/symex" xmlns:wpg="http://schemas.microsoft.com/office/word/2010/wordprocessingGroup" xmlns:wpi="http://schemas.microsoft.com/office/word/2010/wordprocessingInk" xmlns:wne="http://schemas.microsoft.com/office/word/2006/wordml" xmlns:wps="http://schemas.microsoft.com/office/word/2010/wordprocessingShape" mc:Ignorable="w14 w15 w16se w16cid w16 w16cex w16sdtdh w16du wp14">
   <w:endnote w:type="separator" w:id="-1">
     <w:p>
-      <w:pPr>
-        <w:spacing w:after="0"/>
-      </w:pPr>
       <w:r>
         <w:separator/>
       </w:r>
@@ -330,9 +329,6 @@
   </w:endnote>
   <w:endnote w:type="continuationSeparator" w:id="0">
     <w:p>
-      <w:pPr>
-        <w:spacing w:after="0"/>
-      </w:pPr>
       <w:r>
         <w:continuationSeparator/>
       </w:r>
@@ -752,7 +748,10 @@
   <w:style w:type="paragraph" w:default="1" w:styleId="Normal">
     <w:name w:val="Normal"/>
     <w:qFormat/>
-    <w:rsid w:val="006E5BF6"/>
+    <w:rsid w:val="00CD0B92"/>
+    <w:pPr>
+      <w:spacing w:after="0" w:line="360" w:lineRule="auto"/>
+    </w:pPr>
     <w:rPr>
       <w:rFonts w:ascii="Times New Roman" w:hAnsi="Times New Roman"/>
     </w:rPr>
@@ -764,11 +763,11 @@
     <w:link w:val="Heading1Char"/>
     <w:uiPriority w:val="9"/>
     <w:qFormat/>
-    <w:rsid w:val="006407B3"/>
+    <w:rsid w:val="00A53CAF"/>
     <w:pPr>
       <w:keepNext/>
       <w:keepLines/>
-      <w:spacing w:before="360" w:after="80"/>
+      <w:spacing w:before="240" w:after="120"/>
       <w:outlineLvl w:val="0"/>
     </w:pPr>
     <w:rPr>
@@ -786,11 +785,11 @@
     <w:semiHidden/>
     <w:unhideWhenUsed/>
     <w:qFormat/>
-    <w:rsid w:val="00C504BF"/>
+    <w:rsid w:val="00A53CAF"/>
     <w:pPr>
       <w:keepNext/>
       <w:keepLines/>
-      <w:spacing w:before="160" w:after="80"/>
+      <w:spacing w:before="240" w:after="120"/>
       <w:outlineLvl w:val="1"/>
     </w:pPr>
     <w:rPr>
@@ -809,11 +808,11 @@
     <w:semiHidden/>
     <w:unhideWhenUsed/>
     <w:qFormat/>
-    <w:rsid w:val="00125739"/>
+    <w:rsid w:val="00A53CAF"/>
     <w:pPr>
       <w:keepNext/>
       <w:keepLines/>
-      <w:spacing w:before="160" w:after="80"/>
+      <w:spacing w:before="240" w:after="120"/>
       <w:outlineLvl w:val="2"/>
     </w:pPr>
     <w:rPr>
@@ -879,7 +878,7 @@
     <w:pPr>
       <w:keepNext/>
       <w:keepLines/>
-      <w:spacing w:before="40" w:after="0"/>
+      <w:spacing w:before="40"/>
       <w:outlineLvl w:val="5"/>
     </w:pPr>
     <w:rPr>
@@ -902,7 +901,7 @@
     <w:pPr>
       <w:keepNext/>
       <w:keepLines/>
-      <w:spacing w:before="40" w:after="0"/>
+      <w:spacing w:before="40"/>
       <w:outlineLvl w:val="6"/>
     </w:pPr>
     <w:rPr>
@@ -923,7 +922,6 @@
     <w:pPr>
       <w:keepNext/>
       <w:keepLines/>
-      <w:spacing w:after="0"/>
       <w:outlineLvl w:val="7"/>
     </w:pPr>
     <w:rPr>
@@ -946,7 +944,6 @@
     <w:pPr>
       <w:keepNext/>
       <w:keepLines/>
-      <w:spacing w:after="0"/>
       <w:outlineLvl w:val="8"/>
     </w:pPr>
     <w:rPr>
@@ -985,9 +982,9 @@
     <w:name w:val="Body Text"/>
     <w:basedOn w:val="Normal"/>
     <w:qFormat/>
-    <w:rsid w:val="006407B3"/>
-    <w:pPr>
-      <w:spacing w:before="180" w:after="180"/>
+    <w:rsid w:val="0032334C"/>
+    <w:pPr>
+      <w:ind w:firstLine="720"/>
     </w:pPr>
   </w:style>
   <w:style w:type="paragraph" w:customStyle="1" w:styleId="FirstParagraph">
@@ -1106,16 +1103,14 @@
     <w:basedOn w:val="Normal"/>
     <w:next w:val="Abstract"/>
     <w:qFormat/>
+    <w:rsid w:val="00282F61"/>
     <w:pPr>
       <w:keepNext/>
       <w:keepLines/>
-      <w:spacing w:before="300" w:after="0"/>
-      <w:jc w:val="center"/>
+      <w:spacing w:before="300"/>
     </w:pPr>
     <w:rPr>
       <w:b/>
-      <w:color w:val="345A8A"/>
-      <w:sz w:val="20"/>
       <w:szCs w:val="20"/>
     </w:rPr>
   </w:style>
@@ -1138,13 +1133,18 @@
     <w:name w:val="Bibliography"/>
     <w:basedOn w:val="Normal"/>
     <w:qFormat/>
+    <w:rsid w:val="009644C1"/>
+    <w:pPr>
+      <w:spacing w:after="120" w:line="240" w:lineRule="auto"/>
+      <w:ind w:left="720" w:hanging="720"/>
+    </w:pPr>
   </w:style>
   <w:style w:type="character" w:customStyle="1" w:styleId="Heading1Char">
     <w:name w:val="Heading 1 Char"/>
     <w:basedOn w:val="DefaultParagraphFont"/>
     <w:link w:val="Heading1"/>
     <w:uiPriority w:val="9"/>
-    <w:rsid w:val="006407B3"/>
+    <w:rsid w:val="00A53CAF"/>
     <w:rPr>
       <w:rFonts w:ascii="Times New Roman" w:eastAsiaTheme="majorEastAsia" w:hAnsi="Times New Roman" w:cstheme="majorBidi"/>
       <w:b/>
@@ -1157,7 +1157,7 @@
     <w:link w:val="Heading2"/>
     <w:uiPriority w:val="9"/>
     <w:semiHidden/>
-    <w:rsid w:val="00C504BF"/>
+    <w:rsid w:val="00A53CAF"/>
     <w:rPr>
       <w:rFonts w:ascii="Times New Roman" w:eastAsiaTheme="majorEastAsia" w:hAnsi="Times New Roman" w:cstheme="majorBidi"/>
       <w:b/>
@@ -1171,7 +1171,7 @@
     <w:link w:val="Heading3"/>
     <w:uiPriority w:val="9"/>
     <w:semiHidden/>
-    <w:rsid w:val="00125739"/>
+    <w:rsid w:val="00A53CAF"/>
     <w:rPr>
       <w:rFonts w:ascii="Times New Roman" w:eastAsiaTheme="majorEastAsia" w:hAnsi="Times New Roman" w:cstheme="majorBidi"/>
       <w:i/>
@@ -1263,10 +1263,14 @@
     <w:uiPriority w:val="9"/>
     <w:unhideWhenUsed/>
     <w:qFormat/>
-    <w:pPr>
-      <w:spacing w:before="100" w:after="100"/>
-      <w:ind w:left="480" w:right="480"/>
-    </w:pPr>
+    <w:rsid w:val="00F672C9"/>
+    <w:pPr>
+      <w:spacing w:before="120" w:after="120" w:line="240" w:lineRule="auto"/>
+      <w:ind w:left="720" w:right="720" w:firstLine="0"/>
+    </w:pPr>
+    <w:rPr>
+      <w:i/>
+    </w:rPr>
   </w:style>
   <w:style w:type="paragraph" w:styleId="FootnoteText">
     <w:name w:val="footnote text"/>
@@ -1333,7 +1337,6 @@
     <w:pPr>
       <w:keepNext/>
       <w:keepLines/>
-      <w:spacing w:after="0"/>
     </w:pPr>
     <w:rPr>
       <w:b/>
@@ -1412,8 +1415,9 @@
   <w:style w:type="character" w:styleId="Hyperlink">
     <w:name w:val="Hyperlink"/>
     <w:basedOn w:val="CaptionChar"/>
-    <w:rPr>
-      <w:color w:val="156082" w:themeColor="accent1"/>
+    <w:rsid w:val="00282F61"/>
+    <w:rPr>
+      <w:color w:val="auto"/>
     </w:rPr>
   </w:style>
   <w:style w:type="paragraph" w:styleId="TOCHeading">
@@ -1424,7 +1428,7 @@
     <w:unhideWhenUsed/>
     <w:qFormat/>
     <w:pPr>
-      <w:spacing w:before="240" w:line="259" w:lineRule="auto"/>
+      <w:spacing w:line="259" w:lineRule="auto"/>
       <w:outlineLvl w:val="9"/>
     </w:pPr>
     <w:rPr>

</xml_diff>